<commit_message>
update in pdf view page about the bold and text format
</commit_message>
<xml_diff>
--- a/QuotationApp.API/Generated/Q-20260822-68159a0f.docx
+++ b/QuotationApp.API/Generated/Q-20260822-68159a0f.docx
@@ -33,6 +33,7 @@
           <w:p>
             <w:r>
               <w:rPr>
+                <w:rFonts w:ascii="Segoe UI" w:hAnsi="Segoe UI" w:eastAsia="Segoe UI" w:cs="Segoe UI"/>
                 <w:b/>
                 <w:bCs/>
                 <w:color w:val="65AADB"/>
@@ -57,6 +58,7 @@
           <w:p>
             <w:r>
               <w:rPr>
+                <w:rFonts w:ascii="Segoe UI" w:hAnsi="Segoe UI" w:eastAsia="Segoe UI" w:cs="Segoe UI"/>
                 <w:b/>
                 <w:bCs/>
                 <w:color w:val="65AADB"/>
@@ -69,6 +71,7 @@
           <w:p>
             <w:r>
               <w:rPr>
+                <w:rFonts w:ascii="Segoe UI" w:hAnsi="Segoe UI" w:eastAsia="Segoe UI" w:cs="Segoe UI"/>
                 <w:b/>
                 <w:bCs/>
                 <w:color w:val="65AADB"/>
@@ -81,6 +84,7 @@
           <w:p>
             <w:r>
               <w:rPr>
+                <w:rFonts w:ascii="Segoe UI" w:hAnsi="Segoe UI" w:eastAsia="Segoe UI" w:cs="Segoe UI"/>
                 <w:b/>
                 <w:bCs/>
                 <w:color w:val="65AADB"/>
@@ -93,6 +97,7 @@
           <w:p>
             <w:r>
               <w:rPr>
+                <w:rFonts w:ascii="Segoe UI" w:hAnsi="Segoe UI" w:eastAsia="Segoe UI" w:cs="Segoe UI"/>
                 <w:b/>
                 <w:bCs/>
                 <w:color w:val="65AADB"/>
@@ -115,6 +120,7 @@
           <w:p>
             <w:r>
               <w:rPr>
+                <w:rFonts w:ascii="Segoe UI" w:hAnsi="Segoe UI" w:eastAsia="Segoe UI" w:cs="Segoe UI"/>
                 <w:b/>
                 <w:bCs/>
                 <w:color w:val="65AADB"/>
@@ -127,6 +133,7 @@
           <w:p>
             <w:r>
               <w:rPr>
+                <w:rFonts w:ascii="Segoe UI" w:hAnsi="Segoe UI" w:eastAsia="Segoe UI" w:cs="Segoe UI"/>
                 <w:b/>
                 <w:bCs/>
                 <w:color w:val="65AADB"/>
@@ -215,6 +222,7 @@
       </w:pPr>
       <w:r>
         <w:rPr>
+          <w:rFonts w:ascii="Segoe UI" w:hAnsi="Segoe UI" w:eastAsia="Segoe UI" w:cs="Segoe UI"/>
           <w:sz w:val="20"/>
           <w:szCs w:val="20"/>
         </w:rPr>
@@ -230,6 +238,7 @@
       </w:r>
       <w:r>
         <w:rPr>
+          <w:rFonts w:ascii="Segoe UI" w:hAnsi="Segoe UI" w:eastAsia="Segoe UI" w:cs="Segoe UI"/>
           <w:sz w:val="20"/>
           <w:szCs w:val="20"/>
         </w:rPr>
@@ -624,6 +633,7 @@
           <w:p>
             <w:r>
               <w:rPr>
+                <w:rFonts w:ascii="Segoe UI" w:hAnsi="Segoe UI" w:eastAsia="Segoe UI" w:cs="Segoe UI"/>
                 <w:b/>
                 <w:bCs/>
                 <w:color w:val="FFFFFF"/>
@@ -648,6 +658,7 @@
           <w:p>
             <w:r>
               <w:rPr>
+                <w:rFonts w:ascii="Segoe UI" w:hAnsi="Segoe UI" w:eastAsia="Segoe UI" w:cs="Segoe UI"/>
                 <w:b/>
                 <w:bCs/>
                 <w:color w:val="FFFFFF"/>
@@ -672,6 +683,7 @@
           <w:p>
             <w:r>
               <w:rPr>
+                <w:rFonts w:ascii="Segoe UI" w:hAnsi="Segoe UI" w:eastAsia="Segoe UI" w:cs="Segoe UI"/>
                 <w:b/>
                 <w:bCs/>
                 <w:color w:val="FFFFFF"/>
@@ -697,6 +709,7 @@
           <w:p>
             <w:r>
               <w:rPr>
+                <w:rFonts w:ascii="Segoe UI" w:hAnsi="Segoe UI" w:eastAsia="Segoe UI" w:cs="Segoe UI"/>
                 <w:sz w:val="20"/>
                 <w:szCs w:val="20"/>
               </w:rPr>
@@ -717,6 +730,7 @@
           <w:p>
             <w:r>
               <w:rPr>
+                <w:rFonts w:ascii="Segoe UI" w:hAnsi="Segoe UI" w:eastAsia="Segoe UI" w:cs="Segoe UI"/>
                 <w:sz w:val="20"/>
                 <w:szCs w:val="20"/>
               </w:rPr>
@@ -738,10 +752,11 @@
           <w:p>
             <w:r>
               <w:rPr>
-                <w:sz w:val="20"/>
-                <w:szCs w:val="20"/>
-              </w:rPr>
-              <w:t xml:space="preserve">₹1,00,000</w:t>
+                <w:rFonts w:ascii="Segoe UI" w:hAnsi="Segoe UI" w:eastAsia="Segoe UI" w:cs="Segoe UI"/>
+                <w:sz w:val="20"/>
+                <w:szCs w:val="20"/>
+              </w:rPr>
+              <w:t xml:space="preserve">₹97,000</w:t>
             </w:r>
           </w:p>
         </w:tc>
@@ -764,6 +779,7 @@
           <w:p>
             <w:r>
               <w:rPr>
+                <w:rFonts w:ascii="Segoe UI" w:hAnsi="Segoe UI" w:eastAsia="Segoe UI" w:cs="Segoe UI"/>
                 <w:sz w:val="20"/>
                 <w:szCs w:val="20"/>
               </w:rPr>
@@ -785,6 +801,7 @@
           <w:p>
             <w:r>
               <w:rPr>
+                <w:rFonts w:ascii="Segoe UI" w:hAnsi="Segoe UI" w:eastAsia="Segoe UI" w:cs="Segoe UI"/>
                 <w:sz w:val="20"/>
                 <w:szCs w:val="20"/>
               </w:rPr>
@@ -807,6 +824,7 @@
           <w:p>
             <w:r>
               <w:rPr>
+                <w:rFonts w:ascii="Segoe UI" w:hAnsi="Segoe UI" w:eastAsia="Segoe UI" w:cs="Segoe UI"/>
                 <w:sz w:val="20"/>
                 <w:szCs w:val="20"/>
               </w:rPr>
@@ -829,6 +847,7 @@
           <w:p>
             <w:r>
               <w:rPr>
+                <w:rFonts w:ascii="Segoe UI" w:hAnsi="Segoe UI" w:eastAsia="Segoe UI" w:cs="Segoe UI"/>
                 <w:sz w:val="20"/>
                 <w:szCs w:val="20"/>
               </w:rPr>
@@ -849,6 +868,7 @@
           <w:p>
             <w:r>
               <w:rPr>
+                <w:rFonts w:ascii="Segoe UI" w:hAnsi="Segoe UI" w:eastAsia="Segoe UI" w:cs="Segoe UI"/>
                 <w:sz w:val="20"/>
                 <w:szCs w:val="20"/>
               </w:rPr>
@@ -870,6 +890,7 @@
           <w:p>
             <w:r>
               <w:rPr>
+                <w:rFonts w:ascii="Segoe UI" w:hAnsi="Segoe UI" w:eastAsia="Segoe UI" w:cs="Segoe UI"/>
                 <w:sz w:val="20"/>
                 <w:szCs w:val="20"/>
               </w:rPr>
@@ -896,6 +917,7 @@
           <w:p>
             <w:r>
               <w:rPr>
+                <w:rFonts w:ascii="Segoe UI" w:hAnsi="Segoe UI" w:eastAsia="Segoe UI" w:cs="Segoe UI"/>
                 <w:sz w:val="20"/>
                 <w:szCs w:val="20"/>
               </w:rPr>
@@ -917,6 +939,7 @@
           <w:p>
             <w:r>
               <w:rPr>
+                <w:rFonts w:ascii="Segoe UI" w:hAnsi="Segoe UI" w:eastAsia="Segoe UI" w:cs="Segoe UI"/>
                 <w:sz w:val="20"/>
                 <w:szCs w:val="20"/>
               </w:rPr>
@@ -939,6 +962,7 @@
           <w:p>
             <w:r>
               <w:rPr>
+                <w:rFonts w:ascii="Segoe UI" w:hAnsi="Segoe UI" w:eastAsia="Segoe UI" w:cs="Segoe UI"/>
                 <w:sz w:val="20"/>
                 <w:szCs w:val="20"/>
               </w:rPr>
@@ -961,6 +985,7 @@
           <w:p>
             <w:r>
               <w:rPr>
+                <w:rFonts w:ascii="Segoe UI" w:hAnsi="Segoe UI" w:eastAsia="Segoe UI" w:cs="Segoe UI"/>
                 <w:sz w:val="20"/>
                 <w:szCs w:val="20"/>
               </w:rPr>
@@ -981,6 +1006,7 @@
           <w:p>
             <w:r>
               <w:rPr>
+                <w:rFonts w:ascii="Segoe UI" w:hAnsi="Segoe UI" w:eastAsia="Segoe UI" w:cs="Segoe UI"/>
                 <w:sz w:val="20"/>
                 <w:szCs w:val="20"/>
               </w:rPr>
@@ -1004,6 +1030,7 @@
           <w:p>
             <w:r>
               <w:rPr>
+                <w:rFonts w:ascii="Segoe UI" w:hAnsi="Segoe UI" w:eastAsia="Segoe UI" w:cs="Segoe UI"/>
                 <w:sz w:val="20"/>
                 <w:szCs w:val="20"/>
               </w:rPr>
@@ -1030,6 +1057,7 @@
           <w:p>
             <w:r>
               <w:rPr>
+                <w:rFonts w:ascii="Segoe UI" w:hAnsi="Segoe UI" w:eastAsia="Segoe UI" w:cs="Segoe UI"/>
                 <w:sz w:val="20"/>
                 <w:szCs w:val="20"/>
               </w:rPr>
@@ -1051,6 +1079,7 @@
           <w:p>
             <w:r>
               <w:rPr>
+                <w:rFonts w:ascii="Segoe UI" w:hAnsi="Segoe UI" w:eastAsia="Segoe UI" w:cs="Segoe UI"/>
                 <w:sz w:val="20"/>
                 <w:szCs w:val="20"/>
               </w:rPr>
@@ -1072,6 +1101,7 @@
           <w:p>
             <w:r>
               <w:rPr>
+                <w:rFonts w:ascii="Segoe UI" w:hAnsi="Segoe UI" w:eastAsia="Segoe UI" w:cs="Segoe UI"/>
                 <w:sz w:val="20"/>
                 <w:szCs w:val="20"/>
               </w:rPr>
@@ -1094,6 +1124,7 @@
           <w:p>
             <w:r>
               <w:rPr>
+                <w:rFonts w:ascii="Segoe UI" w:hAnsi="Segoe UI" w:eastAsia="Segoe UI" w:cs="Segoe UI"/>
                 <w:sz w:val="20"/>
                 <w:szCs w:val="20"/>
               </w:rPr>
@@ -1114,6 +1145,7 @@
           <w:p>
             <w:r>
               <w:rPr>
+                <w:rFonts w:ascii="Segoe UI" w:hAnsi="Segoe UI" w:eastAsia="Segoe UI" w:cs="Segoe UI"/>
                 <w:sz w:val="20"/>
                 <w:szCs w:val="20"/>
               </w:rPr>
@@ -1134,6 +1166,7 @@
           <w:p>
             <w:r>
               <w:rPr>
+                <w:rFonts w:ascii="Segoe UI" w:hAnsi="Segoe UI" w:eastAsia="Segoe UI" w:cs="Segoe UI"/>
                 <w:sz w:val="20"/>
                 <w:szCs w:val="20"/>
               </w:rPr>
@@ -1160,6 +1193,7 @@
           <w:p>
             <w:r>
               <w:rPr>
+                <w:rFonts w:ascii="Segoe UI" w:hAnsi="Segoe UI" w:eastAsia="Segoe UI" w:cs="Segoe UI"/>
                 <w:sz w:val="20"/>
                 <w:szCs w:val="20"/>
               </w:rPr>
@@ -1181,6 +1215,7 @@
           <w:p>
             <w:r>
               <w:rPr>
+                <w:rFonts w:ascii="Segoe UI" w:hAnsi="Segoe UI" w:eastAsia="Segoe UI" w:cs="Segoe UI"/>
                 <w:sz w:val="20"/>
                 <w:szCs w:val="20"/>
               </w:rPr>
@@ -1202,6 +1237,7 @@
           <w:p>
             <w:r>
               <w:rPr>
+                <w:rFonts w:ascii="Segoe UI" w:hAnsi="Segoe UI" w:eastAsia="Segoe UI" w:cs="Segoe UI"/>
                 <w:sz w:val="20"/>
                 <w:szCs w:val="20"/>
               </w:rPr>
@@ -1224,6 +1260,7 @@
           <w:p>
             <w:r>
               <w:rPr>
+                <w:rFonts w:ascii="Segoe UI" w:hAnsi="Segoe UI" w:eastAsia="Segoe UI" w:cs="Segoe UI"/>
                 <w:sz w:val="20"/>
                 <w:szCs w:val="20"/>
               </w:rPr>
@@ -1244,6 +1281,7 @@
           <w:p>
             <w:r>
               <w:rPr>
+                <w:rFonts w:ascii="Segoe UI" w:hAnsi="Segoe UI" w:eastAsia="Segoe UI" w:cs="Segoe UI"/>
                 <w:sz w:val="20"/>
                 <w:szCs w:val="20"/>
               </w:rPr>
@@ -1264,6 +1302,7 @@
           <w:p>
             <w:r>
               <w:rPr>
+                <w:rFonts w:ascii="Segoe UI" w:hAnsi="Segoe UI" w:eastAsia="Segoe UI" w:cs="Segoe UI"/>
                 <w:sz w:val="20"/>
                 <w:szCs w:val="20"/>
               </w:rPr>
@@ -1290,6 +1329,7 @@
           <w:p>
             <w:r>
               <w:rPr>
+                <w:rFonts w:ascii="Segoe UI" w:hAnsi="Segoe UI" w:eastAsia="Segoe UI" w:cs="Segoe UI"/>
                 <w:sz w:val="20"/>
                 <w:szCs w:val="20"/>
               </w:rPr>
@@ -1311,6 +1351,7 @@
           <w:p>
             <w:r>
               <w:rPr>
+                <w:rFonts w:ascii="Segoe UI" w:hAnsi="Segoe UI" w:eastAsia="Segoe UI" w:cs="Segoe UI"/>
                 <w:sz w:val="20"/>
                 <w:szCs w:val="20"/>
               </w:rPr>
@@ -1332,6 +1373,7 @@
           <w:p>
             <w:r>
               <w:rPr>
+                <w:rFonts w:ascii="Segoe UI" w:hAnsi="Segoe UI" w:eastAsia="Segoe UI" w:cs="Segoe UI"/>
                 <w:sz w:val="20"/>
                 <w:szCs w:val="20"/>
               </w:rPr>
@@ -1354,6 +1396,7 @@
           <w:p>
             <w:r>
               <w:rPr>
+                <w:rFonts w:ascii="Segoe UI" w:hAnsi="Segoe UI" w:eastAsia="Segoe UI" w:cs="Segoe UI"/>
                 <w:sz w:val="20"/>
                 <w:szCs w:val="20"/>
               </w:rPr>
@@ -1374,6 +1417,7 @@
           <w:p>
             <w:r>
               <w:rPr>
+                <w:rFonts w:ascii="Segoe UI" w:hAnsi="Segoe UI" w:eastAsia="Segoe UI" w:cs="Segoe UI"/>
                 <w:sz w:val="20"/>
                 <w:szCs w:val="20"/>
               </w:rPr>
@@ -1394,6 +1438,7 @@
           <w:p>
             <w:r>
               <w:rPr>
+                <w:rFonts w:ascii="Segoe UI" w:hAnsi="Segoe UI" w:eastAsia="Segoe UI" w:cs="Segoe UI"/>
                 <w:sz w:val="20"/>
                 <w:szCs w:val="20"/>
               </w:rPr>
@@ -1416,6 +1461,7 @@
           <w:p>
             <w:r>
               <w:rPr>
+                <w:rFonts w:ascii="Segoe UI" w:hAnsi="Segoe UI" w:eastAsia="Segoe UI" w:cs="Segoe UI"/>
                 <w:sz w:val="20"/>
                 <w:szCs w:val="20"/>
               </w:rPr>
@@ -1436,6 +1482,7 @@
           <w:p>
             <w:r>
               <w:rPr>
+                <w:rFonts w:ascii="Segoe UI" w:hAnsi="Segoe UI" w:eastAsia="Segoe UI" w:cs="Segoe UI"/>
                 <w:sz w:val="20"/>
                 <w:szCs w:val="20"/>
               </w:rPr>
@@ -1457,6 +1504,7 @@
           <w:p>
             <w:r>
               <w:rPr>
+                <w:rFonts w:ascii="Segoe UI" w:hAnsi="Segoe UI" w:eastAsia="Segoe UI" w:cs="Segoe UI"/>
                 <w:sz w:val="20"/>
                 <w:szCs w:val="20"/>
               </w:rPr>
@@ -1474,6 +1522,7 @@
     <w:p>
       <w:r>
         <w:rPr>
+          <w:rFonts w:ascii="Segoe UI" w:hAnsi="Segoe UI" w:eastAsia="Segoe UI" w:cs="Segoe UI"/>
           <w:b/>
           <w:bCs/>
           <w:color w:val="65AADB"/>
@@ -1489,6 +1538,7 @@
     <w:p>
       <w:r>
         <w:rPr>
+          <w:rFonts w:ascii="Segoe UI" w:hAnsi="Segoe UI" w:eastAsia="Segoe UI" w:cs="Segoe UI"/>
           <w:sz w:val="20"/>
           <w:szCs w:val="20"/>
         </w:rPr>
@@ -1496,6 +1546,7 @@
       </w:r>
       <w:r>
         <w:rPr>
+          <w:rFonts w:ascii="Segoe UI" w:hAnsi="Segoe UI" w:eastAsia="Segoe UI" w:cs="Segoe UI"/>
           <w:b/>
           <w:bCs/>
           <w:sz w:val="20"/>
@@ -1505,6 +1556,7 @@
       </w:r>
       <w:r>
         <w:rPr>
+          <w:rFonts w:ascii="Segoe UI" w:hAnsi="Segoe UI" w:eastAsia="Segoe UI" w:cs="Segoe UI"/>
           <w:sz w:val="20"/>
           <w:szCs w:val="20"/>
         </w:rPr>
@@ -1514,6 +1566,7 @@
     <w:p>
       <w:r>
         <w:rPr>
+          <w:rFonts w:ascii="Segoe UI" w:hAnsi="Segoe UI" w:eastAsia="Segoe UI" w:cs="Segoe UI"/>
           <w:sz w:val="20"/>
           <w:szCs w:val="20"/>
         </w:rPr>
@@ -1521,6 +1574,7 @@
       </w:r>
       <w:r>
         <w:rPr>
+          <w:rFonts w:ascii="Segoe UI" w:hAnsi="Segoe UI" w:eastAsia="Segoe UI" w:cs="Segoe UI"/>
           <w:b/>
           <w:bCs/>
           <w:sz w:val="20"/>
@@ -1530,6 +1584,7 @@
       </w:r>
       <w:r>
         <w:rPr>
+          <w:rFonts w:ascii="Segoe UI" w:hAnsi="Segoe UI" w:eastAsia="Segoe UI" w:cs="Segoe UI"/>
           <w:sz w:val="20"/>
           <w:szCs w:val="20"/>
         </w:rPr>
@@ -1539,6 +1594,7 @@
     <w:p>
       <w:r>
         <w:rPr>
+          <w:rFonts w:ascii="Segoe UI" w:hAnsi="Segoe UI" w:eastAsia="Segoe UI" w:cs="Segoe UI"/>
           <w:sz w:val="20"/>
           <w:szCs w:val="20"/>
         </w:rPr>
@@ -1546,6 +1602,7 @@
       </w:r>
       <w:r>
         <w:rPr>
+          <w:rFonts w:ascii="Segoe UI" w:hAnsi="Segoe UI" w:eastAsia="Segoe UI" w:cs="Segoe UI"/>
           <w:b/>
           <w:bCs/>
           <w:sz w:val="20"/>
@@ -1555,6 +1612,7 @@
       </w:r>
       <w:r>
         <w:rPr>
+          <w:rFonts w:ascii="Segoe UI" w:hAnsi="Segoe UI" w:eastAsia="Segoe UI" w:cs="Segoe UI"/>
           <w:sz w:val="20"/>
           <w:szCs w:val="20"/>
         </w:rPr>
@@ -1564,6 +1622,7 @@
     <w:p>
       <w:r>
         <w:rPr>
+          <w:rFonts w:ascii="Segoe UI" w:hAnsi="Segoe UI" w:eastAsia="Segoe UI" w:cs="Segoe UI"/>
           <w:sz w:val="20"/>
           <w:szCs w:val="20"/>
         </w:rPr>
@@ -1571,6 +1630,7 @@
       </w:r>
       <w:r>
         <w:rPr>
+          <w:rFonts w:ascii="Segoe UI" w:hAnsi="Segoe UI" w:eastAsia="Segoe UI" w:cs="Segoe UI"/>
           <w:b/>
           <w:bCs/>
           <w:sz w:val="20"/>
@@ -1580,6 +1640,7 @@
       </w:r>
       <w:r>
         <w:rPr>
+          <w:rFonts w:ascii="Segoe UI" w:hAnsi="Segoe UI" w:eastAsia="Segoe UI" w:cs="Segoe UI"/>
           <w:sz w:val="20"/>
           <w:szCs w:val="20"/>
         </w:rPr>
@@ -1589,6 +1650,7 @@
     <w:p>
       <w:r>
         <w:rPr>
+          <w:rFonts w:ascii="Segoe UI" w:hAnsi="Segoe UI" w:eastAsia="Segoe UI" w:cs="Segoe UI"/>
           <w:sz w:val="20"/>
           <w:szCs w:val="20"/>
         </w:rPr>
@@ -1596,6 +1658,7 @@
       </w:r>
       <w:r>
         <w:rPr>
+          <w:rFonts w:ascii="Segoe UI" w:hAnsi="Segoe UI" w:eastAsia="Segoe UI" w:cs="Segoe UI"/>
           <w:b/>
           <w:bCs/>
           <w:sz w:val="20"/>
@@ -1605,6 +1668,7 @@
       </w:r>
       <w:r>
         <w:rPr>
+          <w:rFonts w:ascii="Segoe UI" w:hAnsi="Segoe UI" w:eastAsia="Segoe UI" w:cs="Segoe UI"/>
           <w:sz w:val="20"/>
           <w:szCs w:val="20"/>
         </w:rPr>
@@ -1614,6 +1678,7 @@
     <w:p>
       <w:r>
         <w:rPr>
+          <w:rFonts w:ascii="Segoe UI" w:hAnsi="Segoe UI" w:eastAsia="Segoe UI" w:cs="Segoe UI"/>
           <w:sz w:val="20"/>
           <w:szCs w:val="20"/>
         </w:rPr>
@@ -1623,6 +1688,7 @@
     <w:p>
       <w:r>
         <w:rPr>
+          <w:rFonts w:ascii="Segoe UI" w:hAnsi="Segoe UI" w:eastAsia="Segoe UI" w:cs="Segoe UI"/>
           <w:sz w:val="20"/>
           <w:szCs w:val="20"/>
         </w:rPr>
@@ -1632,6 +1698,7 @@
     <w:p>
       <w:r>
         <w:rPr>
+          <w:rFonts w:ascii="Segoe UI" w:hAnsi="Segoe UI" w:eastAsia="Segoe UI" w:cs="Segoe UI"/>
           <w:sz w:val="20"/>
           <w:szCs w:val="20"/>
         </w:rPr>
@@ -1641,6 +1708,7 @@
     <w:p>
       <w:r>
         <w:rPr>
+          <w:rFonts w:ascii="Segoe UI" w:hAnsi="Segoe UI" w:eastAsia="Segoe UI" w:cs="Segoe UI"/>
           <w:sz w:val="20"/>
           <w:szCs w:val="20"/>
         </w:rPr>
@@ -1650,6 +1718,7 @@
     <w:p>
       <w:r>
         <w:rPr>
+          <w:rFonts w:ascii="Segoe UI" w:hAnsi="Segoe UI" w:eastAsia="Segoe UI" w:cs="Segoe UI"/>
           <w:sz w:val="20"/>
           <w:szCs w:val="20"/>
         </w:rPr>
@@ -1657,6 +1726,7 @@
       </w:r>
       <w:r>
         <w:rPr>
+          <w:rFonts w:ascii="Segoe UI" w:hAnsi="Segoe UI" w:eastAsia="Segoe UI" w:cs="Segoe UI"/>
           <w:b/>
           <w:bCs/>
           <w:sz w:val="20"/>
@@ -1666,6 +1736,7 @@
       </w:r>
       <w:r>
         <w:rPr>
+          <w:rFonts w:ascii="Segoe UI" w:hAnsi="Segoe UI" w:eastAsia="Segoe UI" w:cs="Segoe UI"/>
           <w:sz w:val="20"/>
           <w:szCs w:val="20"/>
         </w:rPr>
@@ -1675,6 +1746,7 @@
     <w:p>
       <w:r>
         <w:rPr>
+          <w:rFonts w:ascii="Segoe UI" w:hAnsi="Segoe UI" w:eastAsia="Segoe UI" w:cs="Segoe UI"/>
           <w:sz w:val="20"/>
           <w:szCs w:val="20"/>
         </w:rPr>
@@ -1682,6 +1754,7 @@
       </w:r>
       <w:r>
         <w:rPr>
+          <w:rFonts w:ascii="Segoe UI" w:hAnsi="Segoe UI" w:eastAsia="Segoe UI" w:cs="Segoe UI"/>
           <w:b/>
           <w:bCs/>
           <w:sz w:val="20"/>
@@ -1691,6 +1764,7 @@
       </w:r>
       <w:r>
         <w:rPr>
+          <w:rFonts w:ascii="Segoe UI" w:hAnsi="Segoe UI" w:eastAsia="Segoe UI" w:cs="Segoe UI"/>
           <w:sz w:val="20"/>
           <w:szCs w:val="20"/>
         </w:rPr>
@@ -1700,6 +1774,7 @@
     <w:p>
       <w:r>
         <w:rPr>
+          <w:rFonts w:ascii="Segoe UI" w:hAnsi="Segoe UI" w:eastAsia="Segoe UI" w:cs="Segoe UI"/>
           <w:sz w:val="20"/>
           <w:szCs w:val="20"/>
         </w:rPr>
@@ -1709,6 +1784,7 @@
     <w:p>
       <w:r>
         <w:rPr>
+          <w:rFonts w:ascii="Segoe UI" w:hAnsi="Segoe UI" w:eastAsia="Segoe UI" w:cs="Segoe UI"/>
           <w:sz w:val="20"/>
           <w:szCs w:val="20"/>
         </w:rPr>
@@ -1718,6 +1794,7 @@
     <w:p>
       <w:r>
         <w:rPr>
+          <w:rFonts w:ascii="Segoe UI" w:hAnsi="Segoe UI" w:eastAsia="Segoe UI" w:cs="Segoe UI"/>
           <w:sz w:val="20"/>
           <w:szCs w:val="20"/>
         </w:rPr>
@@ -1725,6 +1802,7 @@
       </w:r>
       <w:r>
         <w:rPr>
+          <w:rFonts w:ascii="Segoe UI" w:hAnsi="Segoe UI" w:eastAsia="Segoe UI" w:cs="Segoe UI"/>
           <w:b/>
           <w:bCs/>
           <w:sz w:val="20"/>
@@ -1734,6 +1812,7 @@
       </w:r>
       <w:r>
         <w:rPr>
+          <w:rFonts w:ascii="Segoe UI" w:hAnsi="Segoe UI" w:eastAsia="Segoe UI" w:cs="Segoe UI"/>
           <w:sz w:val="20"/>
           <w:szCs w:val="20"/>
         </w:rPr>
@@ -1743,6 +1822,7 @@
     <w:p>
       <w:r>
         <w:rPr>
+          <w:rFonts w:ascii="Segoe UI" w:hAnsi="Segoe UI" w:eastAsia="Segoe UI" w:cs="Segoe UI"/>
           <w:sz w:val="20"/>
           <w:szCs w:val="20"/>
         </w:rPr>
@@ -1750,6 +1830,7 @@
       </w:r>
       <w:r>
         <w:rPr>
+          <w:rFonts w:ascii="Segoe UI" w:hAnsi="Segoe UI" w:eastAsia="Segoe UI" w:cs="Segoe UI"/>
           <w:b/>
           <w:bCs/>
           <w:sz w:val="20"/>
@@ -1759,6 +1840,7 @@
       </w:r>
       <w:r>
         <w:rPr>
+          <w:rFonts w:ascii="Segoe UI" w:hAnsi="Segoe UI" w:eastAsia="Segoe UI" w:cs="Segoe UI"/>
           <w:sz w:val="20"/>
           <w:szCs w:val="20"/>
         </w:rPr>
@@ -1768,6 +1850,7 @@
     <w:p>
       <w:r>
         <w:rPr>
+          <w:rFonts w:ascii="Segoe UI" w:hAnsi="Segoe UI" w:eastAsia="Segoe UI" w:cs="Segoe UI"/>
           <w:sz w:val="20"/>
           <w:szCs w:val="20"/>
         </w:rPr>
@@ -1775,6 +1858,7 @@
       </w:r>
       <w:r>
         <w:rPr>
+          <w:rFonts w:ascii="Segoe UI" w:hAnsi="Segoe UI" w:eastAsia="Segoe UI" w:cs="Segoe UI"/>
           <w:b/>
           <w:bCs/>
           <w:sz w:val="20"/>
@@ -1784,6 +1868,7 @@
       </w:r>
       <w:r>
         <w:rPr>
+          <w:rFonts w:ascii="Segoe UI" w:hAnsi="Segoe UI" w:eastAsia="Segoe UI" w:cs="Segoe UI"/>
           <w:sz w:val="20"/>
           <w:szCs w:val="20"/>
         </w:rPr>
@@ -1793,6 +1878,7 @@
     <w:p>
       <w:r>
         <w:rPr>
+          <w:rFonts w:ascii="Segoe UI" w:hAnsi="Segoe UI" w:eastAsia="Segoe UI" w:cs="Segoe UI"/>
           <w:sz w:val="20"/>
           <w:szCs w:val="20"/>
         </w:rPr>
@@ -1800,6 +1886,7 @@
       </w:r>
       <w:r>
         <w:rPr>
+          <w:rFonts w:ascii="Segoe UI" w:hAnsi="Segoe UI" w:eastAsia="Segoe UI" w:cs="Segoe UI"/>
           <w:b/>
           <w:bCs/>
           <w:sz w:val="20"/>
@@ -1809,6 +1896,7 @@
       </w:r>
       <w:r>
         <w:rPr>
+          <w:rFonts w:ascii="Segoe UI" w:hAnsi="Segoe UI" w:eastAsia="Segoe UI" w:cs="Segoe UI"/>
           <w:sz w:val="20"/>
           <w:szCs w:val="20"/>
         </w:rPr>
@@ -1821,6 +1909,7 @@
       </w:pPr>
       <w:r>
         <w:rPr>
+          <w:rFonts w:ascii="Segoe UI" w:hAnsi="Segoe UI" w:eastAsia="Segoe UI" w:cs="Segoe UI"/>
           <w:sz w:val="20"/>
           <w:szCs w:val="20"/>
         </w:rPr>
@@ -1833,6 +1922,7 @@
       </w:pPr>
       <w:r>
         <w:rPr>
+          <w:rFonts w:ascii="Segoe UI" w:hAnsi="Segoe UI" w:eastAsia="Segoe UI" w:cs="Segoe UI"/>
           <w:sz w:val="20"/>
           <w:szCs w:val="20"/>
         </w:rPr>
@@ -2038,7 +2128,7 @@
                     <pic:cNvPicPr/>
                   </pic:nvPicPr>
                   <pic:blipFill>
-                    <a:blip r:embed="R0042ed08632f45c5"/>
+                    <a:blip r:embed="R987c170ddf904a35"/>
                     <a:stretch>
                       <a:fillRect/>
                     </a:stretch>

</xml_diff>